<commit_message>
Atualiza os currículos (PT e EN) com os novos certificados e alinha com o site
- Cursos: CS50 SQL concluído, palestras da JUNIP, Engenharia de Software (FIAP),
  Semana Tecnológica UNIP e Santander Fala Mundo
- Going2: cargo, início em 08/2026 e atividades iguais às da página Sobre
- Resumo, competências, formação e idiomas com o mesmo texto do site
- Life OS com o domínio lifeos.vinnisantos.com.br; PendurAi como cofundador

Co-Authored-By: Claude Opus 5.5 <noreply@anthropic.com>
</commit_message>
<xml_diff>
--- a/VINNICIUS_SANTOS_CV.docx
+++ b/VINNICIUS_SANTOS_CV.docx
@@ -134,15 +134,7 @@
         <w:br/>
       </w:r>
       <w:r>
-        <w:t xml:space="preserve">Estudante de Análise e Desenvolvimento de Sistemas com sólida base em lógica de programação, arquitetura de sistemas e desenvolvimento focado em </w:t>
-      </w:r>
-      <w:proofErr w:type="spellStart"/>
-      <w:r>
-        <w:t>backend</w:t>
-      </w:r>
-      <w:proofErr w:type="spellEnd"/>
-      <w:r>
-        <w:t>. Experiência prática na criação de soluções e automações utilizando C#, Python e bancos de dados SQL. Possuo vivência em ambientes dinâmicos industriais e comerciais, o que me proporcionou forte visão de processos de negócio, logística, atendimento B2B e resolução de problemas estruturais. Busco oportunidade para aplicar competências técnicas e contribuir para o ciclo de desenvolvimento de softwares eficientes.</w:t>
+        <w:t xml:space="preserve">Estudante de Análise e Desenvolvimento de Sistemas e estagiário de TI na Going2, onde, além do suporte, desenvolvo uma plataforma B2B interna. Construo SaaS multi-tenant com C#/.NET, Next.js e PostgreSQL, com projetos próprios em produção, entre eles o PendurAi, do qual sou cofundador. A vivência anterior em indústria, vendas e logística me deu visão de processo e de quem usa o sistema.</w:t>
       </w:r>
     </w:p>
     <w:p/>
@@ -177,25 +169,10 @@
           <w:b/>
           <w:bCs/>
         </w:rPr>
-        <w:t>Ferramentas &amp; Controle de Versão</w:t>
-      </w:r>
-      <w:r>
-        <w:rPr>
-          <w:b/>
-          <w:bCs/>
-        </w:rPr>
-        <w:t>:</w:t>
-      </w:r>
-      <w:r>
-        <w:t xml:space="preserve"> </w:t>
-      </w:r>
-      <w:proofErr w:type="spellStart"/>
-      <w:r>
-        <w:t>Git</w:t>
-      </w:r>
-      <w:proofErr w:type="spellEnd"/>
-      <w:r>
-        <w:t>, GitHub, Docker, CLI (Interface de Linha de Comando).</w:t>
+        <w:t xml:space="preserve">Linguagens de Programação:</w:t>
+      </w:r>
+      <w:r>
+        <w:t xml:space="preserve"> C# (.NET), TypeScript, JavaScript, Python, SQL.</w:t>
       </w:r>
     </w:p>
     <w:p>
@@ -210,26 +187,10 @@
           <w:b/>
           <w:bCs/>
         </w:rPr>
-        <w:t>Linguagens de Programação:</w:t>
-      </w:r>
-      <w:r>
-        <w:t xml:space="preserve"> C# (.NET), Python, </w:t>
-      </w:r>
-      <w:proofErr w:type="spellStart"/>
-      <w:r>
-        <w:t>JavaScript</w:t>
-      </w:r>
-      <w:proofErr w:type="spellEnd"/>
-      <w:r>
-        <w:t xml:space="preserve">, </w:t>
-      </w:r>
-      <w:proofErr w:type="spellStart"/>
-      <w:r>
-        <w:t>TypeScript</w:t>
-      </w:r>
-      <w:proofErr w:type="spellEnd"/>
-      <w:r>
-        <w:t>, SQL.</w:t>
+        <w:t xml:space="preserve">Frameworks &amp; Desenvolvimento Web:</w:t>
+      </w:r>
+      <w:r>
+        <w:t xml:space="preserve"> ASP.NET Core (Razor Pages), Next.js (App Router), React, Node.js, Tailwind CSS.</w:t>
       </w:r>
     </w:p>
     <w:p>
@@ -244,26 +205,10 @@
           <w:b/>
           <w:bCs/>
         </w:rPr>
-        <w:t>Frameworks &amp; Desenvolvimento Web:</w:t>
-      </w:r>
-      <w:r>
-        <w:t xml:space="preserve"> ASP.NET Core (</w:t>
-      </w:r>
-      <w:proofErr w:type="spellStart"/>
-      <w:r>
-        <w:t>Razor</w:t>
-      </w:r>
-      <w:proofErr w:type="spellEnd"/>
-      <w:r>
-        <w:t xml:space="preserve"> Pages), </w:t>
-      </w:r>
-      <w:proofErr w:type="spellStart"/>
-      <w:r>
-        <w:t>Flask</w:t>
-      </w:r>
-      <w:proofErr w:type="spellEnd"/>
-      <w:r>
-        <w:t>, Django.</w:t>
+        <w:t xml:space="preserve">Banco de Dados:</w:t>
+      </w:r>
+      <w:r>
+        <w:t xml:space="preserve"> PostgreSQL, Supabase (Auth, RLS), SQL Server, EF Core, Dapper, Drizzle.</w:t>
       </w:r>
     </w:p>
     <w:p>
@@ -278,24 +223,10 @@
           <w:b/>
           <w:bCs/>
         </w:rPr>
-        <w:t>Banco de Dados &amp; Cloud:</w:t>
-      </w:r>
-      <w:r>
-        <w:t xml:space="preserve"> PostgreSQL, SQL Server, </w:t>
-      </w:r>
-      <w:proofErr w:type="spellStart"/>
-      <w:r>
-        <w:t>Supabase</w:t>
-      </w:r>
-      <w:proofErr w:type="spellEnd"/>
-      <w:r>
-        <w:t>, Azure (Conceitos/Integração)</w:t>
-      </w:r>
-      <w:r>
-        <w:t>, Google Cloud Console, Google CLI</w:t>
-      </w:r>
-      <w:r>
-        <w:t>.</w:t>
+        <w:t xml:space="preserve">Infraestrutura &amp; DevOps:</w:t>
+      </w:r>
+      <w:r>
+        <w:t xml:space="preserve"> Docker, AWS EC2, Nginx, GitHub Actions (CI/CD), Google Workspace, GCP, Git, GitHub, CLI.</w:t>
       </w:r>
     </w:p>
     <w:p>
@@ -310,10 +241,10 @@
           <w:b/>
           <w:bCs/>
         </w:rPr>
-        <w:t>Interfaces:</w:t>
-      </w:r>
-      <w:r>
-        <w:t xml:space="preserve"> Noções consolidadas de UX/UI e implementação de interfaces responsivas.</w:t>
+        <w:t xml:space="preserve">Arquitetura, Segurança &amp; Qualidade:</w:t>
+      </w:r>
+      <w:r>
+        <w:t xml:space="preserve"> Multi-tenancy, RBAC, Autenticação, 2FA (TOTP), xUnit, Vitest.</w:t>
       </w:r>
     </w:p>
     <w:p>
@@ -328,31 +259,34 @@
           <w:b/>
           <w:bCs/>
         </w:rPr>
-        <w:t>IA &amp; Engenharia de Prompt:</w:t>
-      </w:r>
-      <w:r>
-        <w:t xml:space="preserve"> </w:t>
-      </w:r>
-      <w:proofErr w:type="spellStart"/>
-      <w:r>
-        <w:t>Deep</w:t>
-      </w:r>
-      <w:proofErr w:type="spellEnd"/>
-      <w:r>
-        <w:t xml:space="preserve"> Learning Interfaces (ChatGPT, Claude AI/Claude </w:t>
-      </w:r>
-      <w:proofErr w:type="spellStart"/>
-      <w:r>
-        <w:t>Code</w:t>
-      </w:r>
-      <w:proofErr w:type="spellEnd"/>
-      <w:r>
-        <w:t>, Gemini), técnicas avançadas de contextualização e automação de código via terminal.</w:t>
+        <w:t xml:space="preserve">Interfaces:</w:t>
+      </w:r>
+      <w:r>
+        <w:t xml:space="preserve"> UX/UI, Interfaces Responsivas.</w:t>
+      </w:r>
+    </w:p>
+    <w:p>
+      <w:pPr>
+        <w:numPr>
+          <w:ilvl w:val="0"/>
+          <w:numId w:val="1"/>
+        </w:numPr>
+      </w:pPr>
+      <w:r>
+        <w:rPr>
+          <w:b/>
+          <w:bCs/>
+        </w:rPr>
+        <w:t xml:space="preserve">IA &amp; Engenharia de Prompt:</w:t>
+      </w:r>
+      <w:r>
+        <w:t xml:space="preserve"> Claude Code, Codex, Gemini, ChatGPT.</w:t>
       </w:r>
     </w:p>
     <w:p/>
     <w:p>
       <w:pPr>
+        <w:pageBreakBefore/>
         <w:rPr>
           <w:b/>
           <w:bCs/>
@@ -371,62 +305,22 @@
       </w:r>
     </w:p>
     <w:p>
-      <w:pPr>
-        <w:rPr>
-          <w:b/>
-          <w:bCs/>
-        </w:rPr>
-      </w:pPr>
-    </w:p>
-    <w:p>
-      <w:r>
-        <w:rPr>
-          <w:b/>
-          <w:bCs/>
-        </w:rPr>
-        <w:t xml:space="preserve">Going2 Corporation </w:t>
+      <w:r>
+        <w:rPr>
+          <w:b/>
+          <w:bCs/>
+        </w:rPr>
+        <w:t xml:space="preserve">Going2 </w:t>
       </w:r>
       <w:r>
         <w:rPr>
           <w:i/>
           <w:iCs/>
         </w:rPr>
-        <w:t xml:space="preserve">Estagiário </w:t>
-      </w:r>
-      <w:proofErr w:type="spellStart"/>
-      <w:r>
-        <w:rPr>
-          <w:i/>
-          <w:iCs/>
-        </w:rPr>
-        <w:t>HelpDesk</w:t>
-      </w:r>
-      <w:proofErr w:type="spellEnd"/>
-      <w:r>
-        <w:rPr>
-          <w:i/>
-          <w:iCs/>
-        </w:rPr>
-        <w:t>/</w:t>
-      </w:r>
-      <w:proofErr w:type="spellStart"/>
-      <w:r>
-        <w:rPr>
-          <w:i/>
-          <w:iCs/>
-        </w:rPr>
-        <w:t>DevOps</w:t>
-      </w:r>
-      <w:proofErr w:type="spellEnd"/>
-      <w:r>
-        <w:rPr>
-          <w:i/>
-          <w:iCs/>
-        </w:rPr>
-        <w:t xml:space="preserve"> TI Interno </w:t>
-      </w:r>
-      <w:r>
-        <w:t>| 07/2026 – Atual</w:t>
+        <w:t xml:space="preserve">Estagiário de TI — Suporte, Governança e Desenvolvimento </w:t>
+      </w:r>
+      <w:r>
+        <w:t xml:space="preserve">| 08/2026 – Atual</w:t>
       </w:r>
     </w:p>
     <w:p>
@@ -444,27 +338,7 @@
         <w:rPr>
           <w:rFonts w:asciiTheme="minorHAnsi" w:hAnsiTheme="minorHAnsi"/>
         </w:rPr>
-        <w:t xml:space="preserve">Gestão de TI e governança, responsável pelo desenvolvimento ponta a ponta de um Portal interno (Next.js, </w:t>
-      </w:r>
-      <w:proofErr w:type="spellStart"/>
-      <w:r>
-        <w:rPr>
-          <w:rFonts w:asciiTheme="minorHAnsi" w:hAnsiTheme="minorHAnsi"/>
-        </w:rPr>
-        <w:t>Supabase</w:t>
-      </w:r>
-      <w:proofErr w:type="spellEnd"/>
-      <w:r>
-        <w:rPr>
-          <w:rFonts w:asciiTheme="minorHAnsi" w:hAnsiTheme="minorHAnsi"/>
-        </w:rPr>
-        <w:t>, AWS EC2) para controle de acessos e auditoria do catálogo de sistemas.</w:t>
-      </w:r>
-      <w:r>
-        <w:rPr>
-          <w:rFonts w:asciiTheme="minorHAnsi" w:hAnsiTheme="minorHAnsi"/>
-        </w:rPr>
-        <w:br/>
+        <w:t xml:space="preserve">Desenvolvimento da plataforma B2B com que a empresa entrega automação e IA aos clientes: assumi um projeto já iniciado e entreguei a visão do cliente, o hub de automações, o módulo de capacitação, o FAQ com assistente e os painéis de gestão e auditoria, além de reformular a interface.</w:t>
       </w:r>
     </w:p>
     <w:p>
@@ -482,19 +356,7 @@
         <w:rPr>
           <w:rFonts w:asciiTheme="minorHAnsi" w:hAnsiTheme="minorHAnsi"/>
         </w:rPr>
-        <w:t>Automação e inovação tecnológica, participando ativamente da criação e implementação de projetos internos utilizando Inteligência Artificial para otimização de processo</w:t>
-      </w:r>
-      <w:r>
-        <w:rPr>
-          <w:rFonts w:asciiTheme="minorHAnsi" w:hAnsiTheme="minorHAnsi"/>
-        </w:rPr>
-        <w:t>s</w:t>
-      </w:r>
-      <w:r>
-        <w:rPr>
-          <w:rFonts w:asciiTheme="minorHAnsi" w:hAnsiTheme="minorHAnsi"/>
-        </w:rPr>
-        <w:br/>
+        <w:t xml:space="preserve">Stack da plataforma: monorepo Next.js 16, React 19 e TypeScript sobre PostgreSQL com Row Level Security por organização, Drizzle ORM, fila de jobs no próprio Postgres e CI no GitHub Actions; cuidei também do deploy em Docker/Dokploy.</w:t>
       </w:r>
     </w:p>
     <w:p>
@@ -512,41 +374,7 @@
         <w:rPr>
           <w:rFonts w:asciiTheme="minorHAnsi" w:hAnsiTheme="minorHAnsi"/>
         </w:rPr>
-        <w:t xml:space="preserve">Responsável pelas rotinas de </w:t>
-      </w:r>
-      <w:proofErr w:type="spellStart"/>
-      <w:r>
-        <w:rPr>
-          <w:rFonts w:asciiTheme="minorHAnsi" w:hAnsiTheme="minorHAnsi"/>
-        </w:rPr>
-        <w:t>DevOps</w:t>
-      </w:r>
-      <w:proofErr w:type="spellEnd"/>
-      <w:r>
-        <w:rPr>
-          <w:rFonts w:asciiTheme="minorHAnsi" w:hAnsiTheme="minorHAnsi"/>
-        </w:rPr>
-        <w:t>, atuando no gerenciamento de infraestrutura em nuvem, configuração de servidores (</w:t>
-      </w:r>
-      <w:proofErr w:type="spellStart"/>
-      <w:r>
-        <w:rPr>
-          <w:rFonts w:asciiTheme="minorHAnsi" w:hAnsiTheme="minorHAnsi"/>
-        </w:rPr>
-        <w:t>Nginx</w:t>
-      </w:r>
-      <w:proofErr w:type="spellEnd"/>
-      <w:r>
-        <w:rPr>
-          <w:rFonts w:asciiTheme="minorHAnsi" w:hAnsiTheme="minorHAnsi"/>
-        </w:rPr>
-        <w:t>/PM2) e manutenção de ambientes para garantir a alta disponibilidade das aplicações</w:t>
-      </w:r>
-      <w:r>
-        <w:rPr>
-          <w:rFonts w:asciiTheme="minorHAnsi" w:hAnsiTheme="minorHAnsi"/>
-        </w:rPr>
-        <w:br/>
+        <w:t xml:space="preserve">Levantamento de requisitos direto com o gestor e os engenheiros de soluções e demonstrações para o time de engenharia, com ciclos curtos de ajuste a partir do feedback (usabilidade, permissões e integrações).</w:t>
       </w:r>
     </w:p>
     <w:p>
@@ -564,21 +392,43 @@
         <w:rPr>
           <w:rFonts w:asciiTheme="minorHAnsi" w:hAnsiTheme="minorHAnsi"/>
         </w:rPr>
-        <w:t xml:space="preserve">Suporte técnico de </w:t>
-      </w:r>
-      <w:proofErr w:type="spellStart"/>
-      <w:r>
+        <w:t xml:space="preserve">Desenvolvimento ponta a ponta do Portal de Governança de TI (Next.js 14, TypeScript e PostgreSQL): RBAC com quatro papéis, solicitação e aprovação de acessos, inventário de hardware com check-in mensal, telefonia, base de conhecimento e trilha de auditoria por triggers. Gravei também o treinamento em vídeo para os usuários.</w:t>
+      </w:r>
+    </w:p>
+    <w:p>
+      <w:pPr>
+        <w:pStyle w:val="NormalWeb"/>
+        <w:numPr>
+          <w:ilvl w:val="0"/>
+          <w:numId w:val="1"/>
+        </w:numPr>
         <w:rPr>
           <w:rFonts w:asciiTheme="minorHAnsi" w:hAnsiTheme="minorHAnsi"/>
         </w:rPr>
-        <w:t>HelpDesk</w:t>
-      </w:r>
-      <w:proofErr w:type="spellEnd"/>
+      </w:pPr>
       <w:r>
         <w:rPr>
           <w:rFonts w:asciiTheme="minorHAnsi" w:hAnsiTheme="minorHAnsi"/>
         </w:rPr>
-        <w:t>, realizando atendimento contínuo, resolução ágil de incidentes e manutenção preventiva e corretiva da infraestrutura tecnológica corporativa.</w:t>
+        <w:t xml:space="preserve">Administração de TI: contas e acessos no Google Workspace (onboarding e offboarding com backup), dispositivos corporativos, cofre de senhas e manutenção de ambientes com Docker, Nginx e PM2 em AWS EC2.</w:t>
+      </w:r>
+    </w:p>
+    <w:p>
+      <w:pPr>
+        <w:pStyle w:val="NormalWeb"/>
+        <w:numPr>
+          <w:ilvl w:val="0"/>
+          <w:numId w:val="1"/>
+        </w:numPr>
+        <w:rPr>
+          <w:rFonts w:asciiTheme="minorHAnsi" w:hAnsiTheme="minorHAnsi"/>
+        </w:rPr>
+      </w:pPr>
+      <w:r>
+        <w:rPr>
+          <w:rFonts w:asciiTheme="minorHAnsi" w:hAnsiTheme="minorHAnsi"/>
+        </w:rPr>
+        <w:t xml:space="preserve">Atendimento (SAC) de uma campanha promocional de alcance nacional: suporte a participantes por e-mail e WhatsApp, validação de notas fiscais e cadastro de ganhadores, seguindo o fluxo com o jurídico e os cuidados de LGPD.</w:t>
       </w:r>
     </w:p>
     <w:p>
@@ -773,24 +623,22 @@
       </w:pPr>
     </w:p>
     <w:p>
-      <w:proofErr w:type="spellStart"/>
-      <w:r>
-        <w:rPr>
-          <w:b/>
-          <w:bCs/>
-        </w:rPr>
-        <w:t>PendurAi</w:t>
-      </w:r>
-      <w:proofErr w:type="spellEnd"/>
-      <w:r>
-        <w:t xml:space="preserve"> – ERP e PDV (SaaS) | </w:t>
+      <w:r>
+        <w:rPr>
+          <w:b/>
+          <w:bCs/>
+        </w:rPr>
+        <w:t xml:space="preserve">PendurAi</w:t>
+      </w:r>
+      <w:r>
+        <w:t xml:space="preserve"> – Cofundador · ERP e PDV (SaaS) para adegas e mercados | </w:t>
       </w:r>
       <w:r>
         <w:rPr>
           <w:i/>
           <w:iCs/>
         </w:rPr>
-        <w:t>pendurai.vinnisantos.com.br</w:t>
+        <w:t xml:space="preserve">pendurai.vinnisantos.com.br</w:t>
       </w:r>
     </w:p>
     <w:p>
@@ -801,15 +649,7 @@
         </w:numPr>
       </w:pPr>
       <w:r>
-        <w:t xml:space="preserve">Arquitetura e desenvolvimento ponta a ponta de uma plataforma </w:t>
-      </w:r>
-      <w:proofErr w:type="spellStart"/>
-      <w:r>
-        <w:t>multi-tenant</w:t>
-      </w:r>
-      <w:proofErr w:type="spellEnd"/>
-      <w:r>
-        <w:t xml:space="preserve"> para gestão de pequenos mercados.</w:t>
+        <w:t xml:space="preserve">Arquitetura e desenvolvimento ponta a ponta de uma plataforma multi-tenant de PDV e ERP para adegas e mercados, em produção (beta).</w:t>
       </w:r>
     </w:p>
     <w:p>
@@ -951,19 +791,7 @@
         <w:rPr>
           <w:lang w:val="en-US"/>
         </w:rPr>
-        <w:t>Stack: C# (.NET 10), Entity Framework Core e GitHub Actions.</w:t>
-      </w:r>
-      <w:r>
-        <w:rPr>
-          <w:lang w:val="en-US"/>
-        </w:rPr>
-        <w:br/>
-      </w:r>
-      <w:r>
-        <w:rPr>
-          <w:lang w:val="en-US"/>
-        </w:rPr>
-        <w:br/>
+        <w:t xml:space="preserve">Stack: C# (.NET 10), ASP.NET Core (Razor Pages), Entity Framework Core, PostgreSQL e GitHub Actions.</w:t>
       </w:r>
     </w:p>
     <w:p>
@@ -1117,7 +945,7 @@
           <w:b/>
           <w:bCs/>
         </w:rPr>
-        <w:t>Life OS</w:t>
+        <w:t xml:space="preserve">Life OS</w:t>
       </w:r>
       <w:r>
         <w:t xml:space="preserve"> – Dashboard de Gestão Pessoal | </w:t>
@@ -1127,7 +955,7 @@
           <w:i/>
           <w:iCs/>
         </w:rPr>
-        <w:t>agenda.vinnisantos.com.br</w:t>
+        <w:t xml:space="preserve">lifeos.vinnisantos.com.br</w:t>
       </w:r>
     </w:p>
     <w:p>
@@ -1149,31 +977,7 @@
         </w:numPr>
       </w:pPr>
       <w:r>
-        <w:t xml:space="preserve">Stack: Next.js 15, </w:t>
-      </w:r>
-      <w:proofErr w:type="spellStart"/>
-      <w:r>
-        <w:t>Tailwind</w:t>
-      </w:r>
-      <w:proofErr w:type="spellEnd"/>
-      <w:r>
-        <w:t xml:space="preserve"> CSS, </w:t>
-      </w:r>
-      <w:proofErr w:type="spellStart"/>
-      <w:r>
-        <w:t>Supabase</w:t>
-      </w:r>
-      <w:proofErr w:type="spellEnd"/>
-      <w:r>
-        <w:t xml:space="preserve"> </w:t>
-      </w:r>
-      <w:proofErr w:type="spellStart"/>
-      <w:r>
-        <w:t>Auth</w:t>
-      </w:r>
-      <w:proofErr w:type="spellEnd"/>
-      <w:r>
-        <w:t>, orquestrado com Docker na AWS EC2.</w:t>
+        <w:t xml:space="preserve">Stack: Next.js 16 (App Router), Supabase (Postgres, Auth e RLS), Drizzle ORM, Tailwind CSS v4 e shadcn/ui, com Docker na AWS EC2.</w:t>
       </w:r>
     </w:p>
     <w:p>
@@ -1386,7 +1190,7 @@
           <w:b/>
           <w:bCs/>
         </w:rPr>
-        <w:t>Universidade Paulista (UNIP)</w:t>
+        <w:t xml:space="preserve">Universidade Paulista (UNIP)</w:t>
       </w:r>
       <w:r>
         <w:t xml:space="preserve"> </w:t>
@@ -1396,28 +1200,12 @@
           <w:i/>
           <w:iCs/>
         </w:rPr>
-        <w:t>Tecnólogo em Análise e Desenvolvimento de Sistemas</w:t>
-      </w:r>
-      <w:r>
-        <w:t xml:space="preserve"> Previsão de Conclusão:</w:t>
-      </w:r>
-      <w:r>
-        <w:t xml:space="preserve"> </w:t>
-      </w:r>
-      <w:proofErr w:type="spellStart"/>
-      <w:r>
-        <w:t>fev</w:t>
-      </w:r>
-      <w:proofErr w:type="spellEnd"/>
-      <w:r>
-        <w:t>/2027</w:t>
-      </w:r>
-      <w:r>
-        <w:t xml:space="preserve"> (Cursando o 3º Semestre – Período Noturno)</w:t>
-      </w:r>
-    </w:p>
-    <w:p/>
-    <w:p/>
+        <w:t xml:space="preserve">Tecnólogo em Análise e Desenvolvimento de Sistemas</w:t>
+      </w:r>
+      <w:r>
+        <w:t xml:space="preserve"> Previsão de conclusão: meados de 2027 (Período Noturno)</w:t>
+      </w:r>
+    </w:p>
     <w:p/>
     <w:p>
       <w:pPr>
@@ -1492,21 +1280,7 @@
         <w:rPr>
           <w:lang w:val="en-US"/>
         </w:rPr>
-        <w:t xml:space="preserve"> – Harvard University / EdX (Em </w:t>
-      </w:r>
-      <w:proofErr w:type="spellStart"/>
-      <w:r>
-        <w:rPr>
-          <w:lang w:val="en-US"/>
-        </w:rPr>
-        <w:t>andamento</w:t>
-      </w:r>
-      <w:proofErr w:type="spellEnd"/>
-      <w:r>
-        <w:rPr>
-          <w:lang w:val="en-US"/>
-        </w:rPr>
-        <w:t>)</w:t>
+        <w:t xml:space="preserve"> – Harvard University / EdX (2026)</w:t>
       </w:r>
     </w:p>
     <w:p>
@@ -1557,23 +1331,84 @@
           <w:b/>
           <w:bCs/>
         </w:rPr>
-        <w:t>Programação Orientada a Objetos (POO) com C#</w:t>
-      </w:r>
-      <w:r>
-        <w:t xml:space="preserve"> – </w:t>
-      </w:r>
-      <w:proofErr w:type="spellStart"/>
-      <w:r>
-        <w:t>Udemy</w:t>
-      </w:r>
-      <w:proofErr w:type="spellEnd"/>
-      <w:r>
-        <w:t xml:space="preserve"> (Em andamento)</w:t>
-      </w:r>
-    </w:p>
-    <w:p/>
-    <w:p/>
-    <w:p/>
+        <w:t>C# Completo: Programação Orientada a Objetos + Projetos (38h)</w:t>
+      </w:r>
+      <w:r>
+        <w:t xml:space="preserve"> – Udemy · Nelio Alves (2026)</w:t>
+      </w:r>
+    </w:p>
+    <w:p>
+      <w:pPr>
+        <w:numPr>
+          <w:ilvl w:val="0"/>
+          <w:numId w:val="4"/>
+        </w:numPr>
+      </w:pPr>
+      <w:r>
+        <w:rPr>
+          <w:b/>
+          <w:bCs/>
+        </w:rPr>
+        <w:t>Engenharia de Software (100h)</w:t>
+      </w:r>
+      <w:r>
+        <w:t xml:space="preserve"> – FIAP (2026)</w:t>
+      </w:r>
+    </w:p>
+    <w:p>
+      <w:pPr>
+        <w:numPr>
+          <w:ilvl w:val="0"/>
+          <w:numId w:val="4"/>
+        </w:numPr>
+      </w:pPr>
+      <w:r>
+        <w:rPr>
+          <w:b/>
+          <w:bCs/>
+        </w:rPr>
+        <w:t>Ciclo de palestras de capacitação: Strategic Sourcing, Liderança, Desenvolvimento de Pessoas e Ideias de Negócio</w:t>
+      </w:r>
+      <w:r>
+        <w:t xml:space="preserve"> – JUNIP, Consultoria UNIP Júnior de Sorocaba (2026)</w:t>
+      </w:r>
+    </w:p>
+    <w:p>
+      <w:pPr>
+        <w:numPr>
+          <w:ilvl w:val="0"/>
+          <w:numId w:val="4"/>
+        </w:numPr>
+      </w:pPr>
+      <w:r>
+        <w:rPr>
+          <w:b/>
+          <w:bCs/>
+        </w:rPr>
+        <w:t>Semana Tecnológica UNIP</w:t>
+      </w:r>
+      <w:r>
+        <w:t xml:space="preserve"> – UNIP / Even3 (2025)</w:t>
+      </w:r>
+    </w:p>
+    <w:p>
+      <w:pPr>
+        <w:numPr>
+          <w:ilvl w:val="0"/>
+          <w:numId w:val="4"/>
+        </w:numPr>
+      </w:pPr>
+      <w:r>
+        <w:rPr>
+          <w:b/>
+          <w:bCs/>
+        </w:rPr>
+        <w:t>Santander Fala Mundo 2026, 3ª Edição (vaga concedida)</w:t>
+      </w:r>
+      <w:r>
+        <w:t xml:space="preserve"> – Santander Open Academy (2026)</w:t>
+      </w:r>
+    </w:p>
     <w:p/>
     <w:p/>
     <w:p>
@@ -1605,10 +1440,10 @@
           <w:b/>
           <w:bCs/>
         </w:rPr>
-        <w:t>Inglês:</w:t>
-      </w:r>
-      <w:r>
-        <w:t xml:space="preserve"> Intermediário. Excelente compreensão de leitura técnica, documentações de APIs, códigos e termos de tecnologia. Boa capacidade de comunicação e escrita.</w:t>
+        <w:t xml:space="preserve">Inglês:</w:t>
+      </w:r>
+      <w:r>
+        <w:t xml:space="preserve"> Intermediário. Leitura técnica segura de documentações, código e APIs, com escrita funcional. Conversação em desenvolvimento.</w:t>
       </w:r>
     </w:p>
     <w:p>
@@ -1629,7 +1464,6 @@
         <w:t xml:space="preserve"> Conhecimento de termos e estruturas linguísticas fundamentais aplicadas à compreensão etimológica e lógica estrutural de idiomas derivados.</w:t>
       </w:r>
     </w:p>
-    <w:p/>
     <w:sectPr>
       <w:pgSz w:w="11906" w:h="16838"/>
       <w:pgMar w:top="1417" w:right="1701" w:bottom="1417" w:left="1701" w:header="708" w:footer="708" w:gutter="0"/>

</xml_diff>